<commit_message>
feat(validation): tmp-smx Fukui + ESP maps on Al(111)
Backfill the local-reactivity artifacts skipped when the tmp-smx case
first shipped: the condensed Fukui maps and the ESP / HOMO-LUMO
isosurfaces the source paper also reports.

- run_fukui (fmo, B3LYP/6-31G(d)) for trimethoprim + sulfamethoxazole
- make_cubes orbital + density/ESP, then make_figures renders fig4
  (Fukui), fig7 (ESP), fig2b (HOMO/LUMO isosurfaces)
- rebuilt the cases/tmp-smx report bundle (report.html now embeds the
  Fukui and ESP sections); the ADR 0021 ranking tie is unchanged
- validation.md Case 4 gains a local-reactivity note: SMX donates from
  the sulfonamide/isoxazole N (top f- +0.26 at N16), TMP from the
  trimethoxybenzyl oxygens and ring carbon (top f- +0.29 at C7),
  qualitative against the paper's maps

part of #200

Co-authored-by: Claude Opus 4.8 <noreply@anthropic.com>
</commit_message>
<xml_diff>
--- a/cases/tmp-smx/report/report.docx
+++ b/cases/tmp-smx/report/report.docx
@@ -16,7 +16,7 @@
           <w:b w:val="0"/>
           <w:color w:val="718096"/>
         </w:rPr>
-        <w:t>Substrate: Al(111)  |  Medium: 1 M HCl  |  DFT level: B3LYP/6-311++G(d,p) (ddCOSMO:water)  |  Generated 2026-07-12 21:14</w:t>
+        <w:t>Substrate: Al(111)  |  Medium: 1 M HCl  |  DFT level: B3LYP/6-311++G(d,p) (ddCOSMO:water)  |  Generated 2026-07-12 22:30</w:t>
       </w:r>
     </w:p>
     <w:p>
@@ -738,8 +738,216 @@
       <w:r>
         <w:drawing>
           <wp:inline xmlns:a="http://schemas.openxmlformats.org/drawingml/2006/main" xmlns:pic="http://schemas.openxmlformats.org/drawingml/2006/picture">
+            <wp:extent cx="2651760" cy="2756387"/>
+            <wp:docPr id="3" name="Picture 3"/>
+            <wp:cNvGraphicFramePr>
+              <a:graphicFrameLocks noChangeAspect="1"/>
+            </wp:cNvGraphicFramePr>
+            <a:graphic>
+              <a:graphicData uri="http://schemas.openxmlformats.org/drawingml/2006/picture">
+                <pic:pic>
+                  <pic:nvPicPr>
+                    <pic:cNvPr id="0" name="fig2b_trimethoprim_homo.png"/>
+                    <pic:cNvPicPr/>
+                  </pic:nvPicPr>
+                  <pic:blipFill>
+                    <a:blip r:embed="rId11"/>
+                    <a:stretch>
+                      <a:fillRect/>
+                    </a:stretch>
+                  </pic:blipFill>
+                  <pic:spPr>
+                    <a:xfrm>
+                      <a:off x="0" y="0"/>
+                      <a:ext cx="2651760" cy="2756387"/>
+                    </a:xfrm>
+                    <a:prstGeom prst="rect"/>
+                  </pic:spPr>
+                </pic:pic>
+              </a:graphicData>
+            </a:graphic>
+          </wp:inline>
+        </w:drawing>
+      </w:r>
+    </w:p>
+    <w:p>
+      <w:pPr>
+        <w:jc w:val="center"/>
+      </w:pPr>
+      <w:r>
+        <w:rPr>
+          <w:i/>
+          <w:color w:val="718096"/>
+          <w:sz w:val="16"/>
+        </w:rPr>
+        <w:t>trimethoprim HOMO</w:t>
+      </w:r>
+    </w:p>
+    <w:p>
+      <w:pPr>
+        <w:jc w:val="center"/>
+      </w:pPr>
+      <w:r>
+        <w:drawing>
+          <wp:inline xmlns:a="http://schemas.openxmlformats.org/drawingml/2006/main" xmlns:pic="http://schemas.openxmlformats.org/drawingml/2006/picture">
+            <wp:extent cx="2651760" cy="2756387"/>
+            <wp:docPr id="4" name="Picture 4"/>
+            <wp:cNvGraphicFramePr>
+              <a:graphicFrameLocks noChangeAspect="1"/>
+            </wp:cNvGraphicFramePr>
+            <a:graphic>
+              <a:graphicData uri="http://schemas.openxmlformats.org/drawingml/2006/picture">
+                <pic:pic>
+                  <pic:nvPicPr>
+                    <pic:cNvPr id="0" name="fig2b_sulfamethoxazole_homo.png"/>
+                    <pic:cNvPicPr/>
+                  </pic:nvPicPr>
+                  <pic:blipFill>
+                    <a:blip r:embed="rId12"/>
+                    <a:stretch>
+                      <a:fillRect/>
+                    </a:stretch>
+                  </pic:blipFill>
+                  <pic:spPr>
+                    <a:xfrm>
+                      <a:off x="0" y="0"/>
+                      <a:ext cx="2651760" cy="2756387"/>
+                    </a:xfrm>
+                    <a:prstGeom prst="rect"/>
+                  </pic:spPr>
+                </pic:pic>
+              </a:graphicData>
+            </a:graphic>
+          </wp:inline>
+        </w:drawing>
+      </w:r>
+    </w:p>
+    <w:p>
+      <w:pPr>
+        <w:jc w:val="center"/>
+      </w:pPr>
+      <w:r>
+        <w:rPr>
+          <w:i/>
+          <w:color w:val="718096"/>
+          <w:sz w:val="16"/>
+        </w:rPr>
+        <w:t>sulfamethoxazole HOMO</w:t>
+      </w:r>
+    </w:p>
+    <w:p>
+      <w:pPr>
+        <w:jc w:val="center"/>
+      </w:pPr>
+      <w:r>
+        <w:drawing>
+          <wp:inline xmlns:a="http://schemas.openxmlformats.org/drawingml/2006/main" xmlns:pic="http://schemas.openxmlformats.org/drawingml/2006/picture">
+            <wp:extent cx="2651760" cy="2756387"/>
+            <wp:docPr id="5" name="Picture 5"/>
+            <wp:cNvGraphicFramePr>
+              <a:graphicFrameLocks noChangeAspect="1"/>
+            </wp:cNvGraphicFramePr>
+            <a:graphic>
+              <a:graphicData uri="http://schemas.openxmlformats.org/drawingml/2006/picture">
+                <pic:pic>
+                  <pic:nvPicPr>
+                    <pic:cNvPr id="0" name="fig2b_trimethoprim_lumo.png"/>
+                    <pic:cNvPicPr/>
+                  </pic:nvPicPr>
+                  <pic:blipFill>
+                    <a:blip r:embed="rId13"/>
+                    <a:stretch>
+                      <a:fillRect/>
+                    </a:stretch>
+                  </pic:blipFill>
+                  <pic:spPr>
+                    <a:xfrm>
+                      <a:off x="0" y="0"/>
+                      <a:ext cx="2651760" cy="2756387"/>
+                    </a:xfrm>
+                    <a:prstGeom prst="rect"/>
+                  </pic:spPr>
+                </pic:pic>
+              </a:graphicData>
+            </a:graphic>
+          </wp:inline>
+        </w:drawing>
+      </w:r>
+    </w:p>
+    <w:p>
+      <w:pPr>
+        <w:jc w:val="center"/>
+      </w:pPr>
+      <w:r>
+        <w:rPr>
+          <w:i/>
+          <w:color w:val="718096"/>
+          <w:sz w:val="16"/>
+        </w:rPr>
+        <w:t>trimethoprim LUMO</w:t>
+      </w:r>
+    </w:p>
+    <w:p>
+      <w:pPr>
+        <w:jc w:val="center"/>
+      </w:pPr>
+      <w:r>
+        <w:drawing>
+          <wp:inline xmlns:a="http://schemas.openxmlformats.org/drawingml/2006/main" xmlns:pic="http://schemas.openxmlformats.org/drawingml/2006/picture">
+            <wp:extent cx="2651760" cy="2756387"/>
+            <wp:docPr id="6" name="Picture 6"/>
+            <wp:cNvGraphicFramePr>
+              <a:graphicFrameLocks noChangeAspect="1"/>
+            </wp:cNvGraphicFramePr>
+            <a:graphic>
+              <a:graphicData uri="http://schemas.openxmlformats.org/drawingml/2006/picture">
+                <pic:pic>
+                  <pic:nvPicPr>
+                    <pic:cNvPr id="0" name="fig2b_sulfamethoxazole_lumo.png"/>
+                    <pic:cNvPicPr/>
+                  </pic:nvPicPr>
+                  <pic:blipFill>
+                    <a:blip r:embed="rId14"/>
+                    <a:stretch>
+                      <a:fillRect/>
+                    </a:stretch>
+                  </pic:blipFill>
+                  <pic:spPr>
+                    <a:xfrm>
+                      <a:off x="0" y="0"/>
+                      <a:ext cx="2651760" cy="2756387"/>
+                    </a:xfrm>
+                    <a:prstGeom prst="rect"/>
+                  </pic:spPr>
+                </pic:pic>
+              </a:graphicData>
+            </a:graphic>
+          </wp:inline>
+        </w:drawing>
+      </w:r>
+    </w:p>
+    <w:p>
+      <w:pPr>
+        <w:jc w:val="center"/>
+      </w:pPr>
+      <w:r>
+        <w:rPr>
+          <w:i/>
+          <w:color w:val="718096"/>
+          <w:sz w:val="16"/>
+        </w:rPr>
+        <w:t>sulfamethoxazole LUMO</w:t>
+      </w:r>
+    </w:p>
+    <w:p>
+      <w:pPr>
+        <w:jc w:val="center"/>
+      </w:pPr>
+      <w:r>
+        <w:drawing>
+          <wp:inline xmlns:a="http://schemas.openxmlformats.org/drawingml/2006/main" xmlns:pic="http://schemas.openxmlformats.org/drawingml/2006/picture">
             <wp:extent cx="5212080" cy="1469064"/>
-            <wp:docPr id="3" name="Picture 3"/>
+            <wp:docPr id="7" name="Picture 7"/>
             <wp:cNvGraphicFramePr>
               <a:graphicFrameLocks noChangeAspect="1"/>
             </wp:cNvGraphicFramePr>
@@ -751,7 +959,7 @@
                     <pic:cNvPicPr/>
                   </pic:nvPicPr>
                   <pic:blipFill>
-                    <a:blip r:embed="rId11"/>
+                    <a:blip r:embed="rId15"/>
                     <a:stretch>
                       <a:fillRect/>
                     </a:stretch>
@@ -791,7 +999,7 @@
         <w:drawing>
           <wp:inline xmlns:a="http://schemas.openxmlformats.org/drawingml/2006/main" xmlns:pic="http://schemas.openxmlformats.org/drawingml/2006/picture">
             <wp:extent cx="5212080" cy="2082725"/>
-            <wp:docPr id="4" name="Picture 4"/>
+            <wp:docPr id="8" name="Picture 8"/>
             <wp:cNvGraphicFramePr>
               <a:graphicFrameLocks noChangeAspect="1"/>
             </wp:cNvGraphicFramePr>
@@ -803,7 +1011,7 @@
                     <pic:cNvPicPr/>
                   </pic:nvPicPr>
                   <pic:blipFill>
-                    <a:blip r:embed="rId12"/>
+                    <a:blip r:embed="rId16"/>
                     <a:stretch>
                       <a:fillRect/>
                     </a:stretch>
@@ -2560,11 +2768,251 @@
       </w:r>
     </w:p>
     <w:p>
+      <w:r>
+        <w:rPr>
+          <w:b/>
+          <w:sz w:val="20"/>
+        </w:rPr>
+        <w:t>trimethoprim</w:t>
+      </w:r>
+      <w:r>
+        <w:rPr>
+          <w:b w:val="0"/>
+          <w:sz w:val="20"/>
+        </w:rPr>
+        <w:t>: O1 (f⁻=0.096), O8 (f⁻=0.059), O10 (f⁻=0.049)</w:t>
+      </w:r>
+    </w:p>
+    <w:p>
+      <w:r>
+        <w:rPr>
+          <w:b/>
+          <w:sz w:val="20"/>
+        </w:rPr>
+        <w:t>sulfamethoxazole</w:t>
+      </w:r>
+      <w:r>
+        <w:rPr>
+          <w:b w:val="0"/>
+          <w:sz w:val="20"/>
+        </w:rPr>
+        <w:t>: O9 (f⁻=0.019), O8 (f⁻=0.013), O5 (f⁻=0.011)</w:t>
+      </w:r>
+    </w:p>
+    <w:p>
+      <w:pPr>
+        <w:jc w:val="center"/>
+      </w:pPr>
+      <w:r>
+        <w:drawing>
+          <wp:inline xmlns:a="http://schemas.openxmlformats.org/drawingml/2006/main" xmlns:pic="http://schemas.openxmlformats.org/drawingml/2006/picture">
+            <wp:extent cx="5212080" cy="2018957"/>
+            <wp:docPr id="9" name="Picture 9"/>
+            <wp:cNvGraphicFramePr>
+              <a:graphicFrameLocks noChangeAspect="1"/>
+            </wp:cNvGraphicFramePr>
+            <a:graphic>
+              <a:graphicData uri="http://schemas.openxmlformats.org/drawingml/2006/picture">
+                <pic:pic>
+                  <pic:nvPicPr>
+                    <pic:cNvPr id="0" name="fig4_trimethoprim_fukui.png"/>
+                    <pic:cNvPicPr/>
+                  </pic:nvPicPr>
+                  <pic:blipFill>
+                    <a:blip r:embed="rId17"/>
+                    <a:stretch>
+                      <a:fillRect/>
+                    </a:stretch>
+                  </pic:blipFill>
+                  <pic:spPr>
+                    <a:xfrm>
+                      <a:off x="0" y="0"/>
+                      <a:ext cx="5212080" cy="2018957"/>
+                    </a:xfrm>
+                    <a:prstGeom prst="rect"/>
+                  </pic:spPr>
+                </pic:pic>
+              </a:graphicData>
+            </a:graphic>
+          </wp:inline>
+        </w:drawing>
+      </w:r>
+    </w:p>
+    <w:p>
+      <w:pPr>
+        <w:jc w:val="center"/>
+      </w:pPr>
+      <w:r>
+        <w:rPr>
+          <w:i/>
+          <w:color w:val="718096"/>
+          <w:sz w:val="16"/>
+        </w:rPr>
+        <w:t>trimethoprim — condensed Fukui</w:t>
+      </w:r>
+    </w:p>
+    <w:p>
+      <w:pPr>
+        <w:jc w:val="center"/>
+      </w:pPr>
+      <w:r>
+        <w:drawing>
+          <wp:inline xmlns:a="http://schemas.openxmlformats.org/drawingml/2006/main" xmlns:pic="http://schemas.openxmlformats.org/drawingml/2006/picture">
+            <wp:extent cx="5212080" cy="2018957"/>
+            <wp:docPr id="10" name="Picture 10"/>
+            <wp:cNvGraphicFramePr>
+              <a:graphicFrameLocks noChangeAspect="1"/>
+            </wp:cNvGraphicFramePr>
+            <a:graphic>
+              <a:graphicData uri="http://schemas.openxmlformats.org/drawingml/2006/picture">
+                <pic:pic>
+                  <pic:nvPicPr>
+                    <pic:cNvPr id="0" name="fig4_sulfamethoxazole_fukui.png"/>
+                    <pic:cNvPicPr/>
+                  </pic:nvPicPr>
+                  <pic:blipFill>
+                    <a:blip r:embed="rId18"/>
+                    <a:stretch>
+                      <a:fillRect/>
+                    </a:stretch>
+                  </pic:blipFill>
+                  <pic:spPr>
+                    <a:xfrm>
+                      <a:off x="0" y="0"/>
+                      <a:ext cx="5212080" cy="2018957"/>
+                    </a:xfrm>
+                    <a:prstGeom prst="rect"/>
+                  </pic:spPr>
+                </pic:pic>
+              </a:graphicData>
+            </a:graphic>
+          </wp:inline>
+        </w:drawing>
+      </w:r>
+    </w:p>
+    <w:p>
+      <w:pPr>
+        <w:jc w:val="center"/>
+      </w:pPr>
+      <w:r>
+        <w:rPr>
+          <w:i/>
+          <w:color w:val="718096"/>
+          <w:sz w:val="16"/>
+        </w:rPr>
+        <w:t>sulfamethoxazole — condensed Fukui</w:t>
+      </w:r>
+    </w:p>
+    <w:p>
       <w:pPr>
         <w:pStyle w:val="Heading2"/>
       </w:pPr>
       <w:r>
         <w:t>3.6 Electrostatic-potential (ESP) map</w:t>
+      </w:r>
+    </w:p>
+    <w:p>
+      <w:pPr>
+        <w:jc w:val="center"/>
+      </w:pPr>
+      <w:r>
+        <w:drawing>
+          <wp:inline xmlns:a="http://schemas.openxmlformats.org/drawingml/2006/main" xmlns:pic="http://schemas.openxmlformats.org/drawingml/2006/picture">
+            <wp:extent cx="2651760" cy="2348964"/>
+            <wp:docPr id="11" name="Picture 11"/>
+            <wp:cNvGraphicFramePr>
+              <a:graphicFrameLocks noChangeAspect="1"/>
+            </wp:cNvGraphicFramePr>
+            <a:graphic>
+              <a:graphicData uri="http://schemas.openxmlformats.org/drawingml/2006/picture">
+                <pic:pic>
+                  <pic:nvPicPr>
+                    <pic:cNvPr id="0" name="fig7_trimethoprim_esp.png"/>
+                    <pic:cNvPicPr/>
+                  </pic:nvPicPr>
+                  <pic:blipFill>
+                    <a:blip r:embed="rId19"/>
+                    <a:stretch>
+                      <a:fillRect/>
+                    </a:stretch>
+                  </pic:blipFill>
+                  <pic:spPr>
+                    <a:xfrm>
+                      <a:off x="0" y="0"/>
+                      <a:ext cx="2651760" cy="2348964"/>
+                    </a:xfrm>
+                    <a:prstGeom prst="rect"/>
+                  </pic:spPr>
+                </pic:pic>
+              </a:graphicData>
+            </a:graphic>
+          </wp:inline>
+        </w:drawing>
+      </w:r>
+    </w:p>
+    <w:p>
+      <w:pPr>
+        <w:jc w:val="center"/>
+      </w:pPr>
+      <w:r>
+        <w:rPr>
+          <w:i/>
+          <w:color w:val="718096"/>
+          <w:sz w:val="16"/>
+        </w:rPr>
+        <w:t>trimethoprim — ESP map</w:t>
+      </w:r>
+    </w:p>
+    <w:p>
+      <w:pPr>
+        <w:jc w:val="center"/>
+      </w:pPr>
+      <w:r>
+        <w:drawing>
+          <wp:inline xmlns:a="http://schemas.openxmlformats.org/drawingml/2006/main" xmlns:pic="http://schemas.openxmlformats.org/drawingml/2006/picture">
+            <wp:extent cx="2651760" cy="2348964"/>
+            <wp:docPr id="12" name="Picture 12"/>
+            <wp:cNvGraphicFramePr>
+              <a:graphicFrameLocks noChangeAspect="1"/>
+            </wp:cNvGraphicFramePr>
+            <a:graphic>
+              <a:graphicData uri="http://schemas.openxmlformats.org/drawingml/2006/picture">
+                <pic:pic>
+                  <pic:nvPicPr>
+                    <pic:cNvPr id="0" name="fig7_sulfamethoxazole_esp.png"/>
+                    <pic:cNvPicPr/>
+                  </pic:nvPicPr>
+                  <pic:blipFill>
+                    <a:blip r:embed="rId20"/>
+                    <a:stretch>
+                      <a:fillRect/>
+                    </a:stretch>
+                  </pic:blipFill>
+                  <pic:spPr>
+                    <a:xfrm>
+                      <a:off x="0" y="0"/>
+                      <a:ext cx="2651760" cy="2348964"/>
+                    </a:xfrm>
+                    <a:prstGeom prst="rect"/>
+                  </pic:spPr>
+                </pic:pic>
+              </a:graphicData>
+            </a:graphic>
+          </wp:inline>
+        </w:drawing>
+      </w:r>
+    </w:p>
+    <w:p>
+      <w:pPr>
+        <w:jc w:val="center"/>
+      </w:pPr>
+      <w:r>
+        <w:rPr>
+          <w:i/>
+          <w:color w:val="718096"/>
+          <w:sz w:val="16"/>
+        </w:rPr>
+        <w:t>sulfamethoxazole — ESP map</w:t>
       </w:r>
     </w:p>
     <w:p>
@@ -2583,7 +3031,7 @@
         <w:drawing>
           <wp:inline xmlns:a="http://schemas.openxmlformats.org/drawingml/2006/main" xmlns:pic="http://schemas.openxmlformats.org/drawingml/2006/picture">
             <wp:extent cx="5212080" cy="2531818"/>
-            <wp:docPr id="5" name="Picture 5"/>
+            <wp:docPr id="13" name="Picture 13"/>
             <wp:cNvGraphicFramePr>
               <a:graphicFrameLocks noChangeAspect="1"/>
             </wp:cNvGraphicFramePr>
@@ -2595,7 +3043,7 @@
                     <pic:cNvPicPr/>
                   </pic:nvPicPr>
                   <pic:blipFill>
-                    <a:blip r:embed="rId13"/>
+                    <a:blip r:embed="rId21"/>
                     <a:stretch>
                       <a:fillRect/>
                     </a:stretch>
@@ -2635,7 +3083,7 @@
         <w:drawing>
           <wp:inline xmlns:a="http://schemas.openxmlformats.org/drawingml/2006/main" xmlns:pic="http://schemas.openxmlformats.org/drawingml/2006/picture">
             <wp:extent cx="5212080" cy="2531818"/>
-            <wp:docPr id="6" name="Picture 6"/>
+            <wp:docPr id="14" name="Picture 14"/>
             <wp:cNvGraphicFramePr>
               <a:graphicFrameLocks noChangeAspect="1"/>
             </wp:cNvGraphicFramePr>
@@ -2647,7 +3095,7 @@
                     <pic:cNvPicPr/>
                   </pic:nvPicPr>
                   <pic:blipFill>
-                    <a:blip r:embed="rId14"/>
+                    <a:blip r:embed="rId22"/>
                     <a:stretch>
                       <a:fillRect/>
                     </a:stretch>
@@ -2687,7 +3135,7 @@
         <w:drawing>
           <wp:inline xmlns:a="http://schemas.openxmlformats.org/drawingml/2006/main" xmlns:pic="http://schemas.openxmlformats.org/drawingml/2006/picture">
             <wp:extent cx="5212080" cy="2716362"/>
-            <wp:docPr id="7" name="Picture 7"/>
+            <wp:docPr id="15" name="Picture 15"/>
             <wp:cNvGraphicFramePr>
               <a:graphicFrameLocks noChangeAspect="1"/>
             </wp:cNvGraphicFramePr>
@@ -2699,7 +3147,7 @@
                     <pic:cNvPicPr/>
                   </pic:nvPicPr>
                   <pic:blipFill>
-                    <a:blip r:embed="rId15"/>
+                    <a:blip r:embed="rId23"/>
                     <a:stretch>
                       <a:fillRect/>
                     </a:stretch>
@@ -2739,7 +3187,7 @@
         <w:drawing>
           <wp:inline xmlns:a="http://schemas.openxmlformats.org/drawingml/2006/main" xmlns:pic="http://schemas.openxmlformats.org/drawingml/2006/picture">
             <wp:extent cx="5212080" cy="2713809"/>
-            <wp:docPr id="8" name="Picture 8"/>
+            <wp:docPr id="16" name="Picture 16"/>
             <wp:cNvGraphicFramePr>
               <a:graphicFrameLocks noChangeAspect="1"/>
             </wp:cNvGraphicFramePr>
@@ -2751,7 +3199,7 @@
                     <pic:cNvPicPr/>
                   </pic:nvPicPr>
                   <pic:blipFill>
-                    <a:blip r:embed="rId16"/>
+                    <a:blip r:embed="rId24"/>
                     <a:stretch>
                       <a:fillRect/>
                     </a:stretch>
@@ -2799,7 +3247,7 @@
         <w:drawing>
           <wp:inline xmlns:a="http://schemas.openxmlformats.org/drawingml/2006/main" xmlns:pic="http://schemas.openxmlformats.org/drawingml/2006/picture">
             <wp:extent cx="5212080" cy="2860766"/>
-            <wp:docPr id="9" name="Picture 9"/>
+            <wp:docPr id="17" name="Picture 17"/>
             <wp:cNvGraphicFramePr>
               <a:graphicFrameLocks noChangeAspect="1"/>
             </wp:cNvGraphicFramePr>
@@ -2811,7 +3259,7 @@
                     <pic:cNvPicPr/>
                   </pic:nvPicPr>
                   <pic:blipFill>
-                    <a:blip r:embed="rId17"/>
+                    <a:blip r:embed="rId25"/>
                     <a:stretch>
                       <a:fillRect/>
                     </a:stretch>
@@ -2851,7 +3299,7 @@
         <w:drawing>
           <wp:inline xmlns:a="http://schemas.openxmlformats.org/drawingml/2006/main" xmlns:pic="http://schemas.openxmlformats.org/drawingml/2006/picture">
             <wp:extent cx="5212080" cy="2860766"/>
-            <wp:docPr id="10" name="Picture 10"/>
+            <wp:docPr id="18" name="Picture 18"/>
             <wp:cNvGraphicFramePr>
               <a:graphicFrameLocks noChangeAspect="1"/>
             </wp:cNvGraphicFramePr>
@@ -2863,7 +3311,7 @@
                     <pic:cNvPicPr/>
                   </pic:nvPicPr>
                   <pic:blipFill>
-                    <a:blip r:embed="rId18"/>
+                    <a:blip r:embed="rId26"/>
                     <a:stretch>
                       <a:fillRect/>
                     </a:stretch>

</xml_diff>

<commit_message>
feat(validation): tmp-smx Fukui + ESP maps on Al(111) (#207)
Backfill the local-reactivity artifacts skipped when the tmp-smx case
first shipped: the condensed Fukui maps and the ESP / HOMO-LUMO
isosurfaces the source paper also reports.

- run_fukui (fmo, B3LYP/6-31G(d)) for trimethoprim + sulfamethoxazole
- make_cubes orbital + density/ESP, then make_figures renders fig4
  (Fukui), fig7 (ESP), fig2b (HOMO/LUMO isosurfaces)
- rebuilt the cases/tmp-smx report bundle (report.html now embeds the
  Fukui and ESP sections); the ADR 0021 ranking tie is unchanged
- validation.md Case 4 gains a local-reactivity note: SMX donates from
  the sulfonamide/isoxazole N (top f- +0.26 at N16), TMP from the
  trimethoxybenzyl oxygens and ring carbon (top f- +0.29 at C7),
  qualitative against the paper's maps

part of #200

Co-authored-by: Claude Opus 4.8 <noreply@anthropic.com>
</commit_message>
<xml_diff>
--- a/cases/tmp-smx/report/report.docx
+++ b/cases/tmp-smx/report/report.docx
@@ -16,7 +16,7 @@
           <w:b w:val="0"/>
           <w:color w:val="718096"/>
         </w:rPr>
-        <w:t>Substrate: Al(111)  |  Medium: 1 M HCl  |  DFT level: B3LYP/6-311++G(d,p) (ddCOSMO:water)  |  Generated 2026-07-12 21:14</w:t>
+        <w:t>Substrate: Al(111)  |  Medium: 1 M HCl  |  DFT level: B3LYP/6-311++G(d,p) (ddCOSMO:water)  |  Generated 2026-07-12 22:30</w:t>
       </w:r>
     </w:p>
     <w:p>
@@ -738,8 +738,216 @@
       <w:r>
         <w:drawing>
           <wp:inline xmlns:a="http://schemas.openxmlformats.org/drawingml/2006/main" xmlns:pic="http://schemas.openxmlformats.org/drawingml/2006/picture">
+            <wp:extent cx="2651760" cy="2756387"/>
+            <wp:docPr id="3" name="Picture 3"/>
+            <wp:cNvGraphicFramePr>
+              <a:graphicFrameLocks noChangeAspect="1"/>
+            </wp:cNvGraphicFramePr>
+            <a:graphic>
+              <a:graphicData uri="http://schemas.openxmlformats.org/drawingml/2006/picture">
+                <pic:pic>
+                  <pic:nvPicPr>
+                    <pic:cNvPr id="0" name="fig2b_trimethoprim_homo.png"/>
+                    <pic:cNvPicPr/>
+                  </pic:nvPicPr>
+                  <pic:blipFill>
+                    <a:blip r:embed="rId11"/>
+                    <a:stretch>
+                      <a:fillRect/>
+                    </a:stretch>
+                  </pic:blipFill>
+                  <pic:spPr>
+                    <a:xfrm>
+                      <a:off x="0" y="0"/>
+                      <a:ext cx="2651760" cy="2756387"/>
+                    </a:xfrm>
+                    <a:prstGeom prst="rect"/>
+                  </pic:spPr>
+                </pic:pic>
+              </a:graphicData>
+            </a:graphic>
+          </wp:inline>
+        </w:drawing>
+      </w:r>
+    </w:p>
+    <w:p>
+      <w:pPr>
+        <w:jc w:val="center"/>
+      </w:pPr>
+      <w:r>
+        <w:rPr>
+          <w:i/>
+          <w:color w:val="718096"/>
+          <w:sz w:val="16"/>
+        </w:rPr>
+        <w:t>trimethoprim HOMO</w:t>
+      </w:r>
+    </w:p>
+    <w:p>
+      <w:pPr>
+        <w:jc w:val="center"/>
+      </w:pPr>
+      <w:r>
+        <w:drawing>
+          <wp:inline xmlns:a="http://schemas.openxmlformats.org/drawingml/2006/main" xmlns:pic="http://schemas.openxmlformats.org/drawingml/2006/picture">
+            <wp:extent cx="2651760" cy="2756387"/>
+            <wp:docPr id="4" name="Picture 4"/>
+            <wp:cNvGraphicFramePr>
+              <a:graphicFrameLocks noChangeAspect="1"/>
+            </wp:cNvGraphicFramePr>
+            <a:graphic>
+              <a:graphicData uri="http://schemas.openxmlformats.org/drawingml/2006/picture">
+                <pic:pic>
+                  <pic:nvPicPr>
+                    <pic:cNvPr id="0" name="fig2b_sulfamethoxazole_homo.png"/>
+                    <pic:cNvPicPr/>
+                  </pic:nvPicPr>
+                  <pic:blipFill>
+                    <a:blip r:embed="rId12"/>
+                    <a:stretch>
+                      <a:fillRect/>
+                    </a:stretch>
+                  </pic:blipFill>
+                  <pic:spPr>
+                    <a:xfrm>
+                      <a:off x="0" y="0"/>
+                      <a:ext cx="2651760" cy="2756387"/>
+                    </a:xfrm>
+                    <a:prstGeom prst="rect"/>
+                  </pic:spPr>
+                </pic:pic>
+              </a:graphicData>
+            </a:graphic>
+          </wp:inline>
+        </w:drawing>
+      </w:r>
+    </w:p>
+    <w:p>
+      <w:pPr>
+        <w:jc w:val="center"/>
+      </w:pPr>
+      <w:r>
+        <w:rPr>
+          <w:i/>
+          <w:color w:val="718096"/>
+          <w:sz w:val="16"/>
+        </w:rPr>
+        <w:t>sulfamethoxazole HOMO</w:t>
+      </w:r>
+    </w:p>
+    <w:p>
+      <w:pPr>
+        <w:jc w:val="center"/>
+      </w:pPr>
+      <w:r>
+        <w:drawing>
+          <wp:inline xmlns:a="http://schemas.openxmlformats.org/drawingml/2006/main" xmlns:pic="http://schemas.openxmlformats.org/drawingml/2006/picture">
+            <wp:extent cx="2651760" cy="2756387"/>
+            <wp:docPr id="5" name="Picture 5"/>
+            <wp:cNvGraphicFramePr>
+              <a:graphicFrameLocks noChangeAspect="1"/>
+            </wp:cNvGraphicFramePr>
+            <a:graphic>
+              <a:graphicData uri="http://schemas.openxmlformats.org/drawingml/2006/picture">
+                <pic:pic>
+                  <pic:nvPicPr>
+                    <pic:cNvPr id="0" name="fig2b_trimethoprim_lumo.png"/>
+                    <pic:cNvPicPr/>
+                  </pic:nvPicPr>
+                  <pic:blipFill>
+                    <a:blip r:embed="rId13"/>
+                    <a:stretch>
+                      <a:fillRect/>
+                    </a:stretch>
+                  </pic:blipFill>
+                  <pic:spPr>
+                    <a:xfrm>
+                      <a:off x="0" y="0"/>
+                      <a:ext cx="2651760" cy="2756387"/>
+                    </a:xfrm>
+                    <a:prstGeom prst="rect"/>
+                  </pic:spPr>
+                </pic:pic>
+              </a:graphicData>
+            </a:graphic>
+          </wp:inline>
+        </w:drawing>
+      </w:r>
+    </w:p>
+    <w:p>
+      <w:pPr>
+        <w:jc w:val="center"/>
+      </w:pPr>
+      <w:r>
+        <w:rPr>
+          <w:i/>
+          <w:color w:val="718096"/>
+          <w:sz w:val="16"/>
+        </w:rPr>
+        <w:t>trimethoprim LUMO</w:t>
+      </w:r>
+    </w:p>
+    <w:p>
+      <w:pPr>
+        <w:jc w:val="center"/>
+      </w:pPr>
+      <w:r>
+        <w:drawing>
+          <wp:inline xmlns:a="http://schemas.openxmlformats.org/drawingml/2006/main" xmlns:pic="http://schemas.openxmlformats.org/drawingml/2006/picture">
+            <wp:extent cx="2651760" cy="2756387"/>
+            <wp:docPr id="6" name="Picture 6"/>
+            <wp:cNvGraphicFramePr>
+              <a:graphicFrameLocks noChangeAspect="1"/>
+            </wp:cNvGraphicFramePr>
+            <a:graphic>
+              <a:graphicData uri="http://schemas.openxmlformats.org/drawingml/2006/picture">
+                <pic:pic>
+                  <pic:nvPicPr>
+                    <pic:cNvPr id="0" name="fig2b_sulfamethoxazole_lumo.png"/>
+                    <pic:cNvPicPr/>
+                  </pic:nvPicPr>
+                  <pic:blipFill>
+                    <a:blip r:embed="rId14"/>
+                    <a:stretch>
+                      <a:fillRect/>
+                    </a:stretch>
+                  </pic:blipFill>
+                  <pic:spPr>
+                    <a:xfrm>
+                      <a:off x="0" y="0"/>
+                      <a:ext cx="2651760" cy="2756387"/>
+                    </a:xfrm>
+                    <a:prstGeom prst="rect"/>
+                  </pic:spPr>
+                </pic:pic>
+              </a:graphicData>
+            </a:graphic>
+          </wp:inline>
+        </w:drawing>
+      </w:r>
+    </w:p>
+    <w:p>
+      <w:pPr>
+        <w:jc w:val="center"/>
+      </w:pPr>
+      <w:r>
+        <w:rPr>
+          <w:i/>
+          <w:color w:val="718096"/>
+          <w:sz w:val="16"/>
+        </w:rPr>
+        <w:t>sulfamethoxazole LUMO</w:t>
+      </w:r>
+    </w:p>
+    <w:p>
+      <w:pPr>
+        <w:jc w:val="center"/>
+      </w:pPr>
+      <w:r>
+        <w:drawing>
+          <wp:inline xmlns:a="http://schemas.openxmlformats.org/drawingml/2006/main" xmlns:pic="http://schemas.openxmlformats.org/drawingml/2006/picture">
             <wp:extent cx="5212080" cy="1469064"/>
-            <wp:docPr id="3" name="Picture 3"/>
+            <wp:docPr id="7" name="Picture 7"/>
             <wp:cNvGraphicFramePr>
               <a:graphicFrameLocks noChangeAspect="1"/>
             </wp:cNvGraphicFramePr>
@@ -751,7 +959,7 @@
                     <pic:cNvPicPr/>
                   </pic:nvPicPr>
                   <pic:blipFill>
-                    <a:blip r:embed="rId11"/>
+                    <a:blip r:embed="rId15"/>
                     <a:stretch>
                       <a:fillRect/>
                     </a:stretch>
@@ -791,7 +999,7 @@
         <w:drawing>
           <wp:inline xmlns:a="http://schemas.openxmlformats.org/drawingml/2006/main" xmlns:pic="http://schemas.openxmlformats.org/drawingml/2006/picture">
             <wp:extent cx="5212080" cy="2082725"/>
-            <wp:docPr id="4" name="Picture 4"/>
+            <wp:docPr id="8" name="Picture 8"/>
             <wp:cNvGraphicFramePr>
               <a:graphicFrameLocks noChangeAspect="1"/>
             </wp:cNvGraphicFramePr>
@@ -803,7 +1011,7 @@
                     <pic:cNvPicPr/>
                   </pic:nvPicPr>
                   <pic:blipFill>
-                    <a:blip r:embed="rId12"/>
+                    <a:blip r:embed="rId16"/>
                     <a:stretch>
                       <a:fillRect/>
                     </a:stretch>
@@ -2560,11 +2768,251 @@
       </w:r>
     </w:p>
     <w:p>
+      <w:r>
+        <w:rPr>
+          <w:b/>
+          <w:sz w:val="20"/>
+        </w:rPr>
+        <w:t>trimethoprim</w:t>
+      </w:r>
+      <w:r>
+        <w:rPr>
+          <w:b w:val="0"/>
+          <w:sz w:val="20"/>
+        </w:rPr>
+        <w:t>: O1 (f⁻=0.096), O8 (f⁻=0.059), O10 (f⁻=0.049)</w:t>
+      </w:r>
+    </w:p>
+    <w:p>
+      <w:r>
+        <w:rPr>
+          <w:b/>
+          <w:sz w:val="20"/>
+        </w:rPr>
+        <w:t>sulfamethoxazole</w:t>
+      </w:r>
+      <w:r>
+        <w:rPr>
+          <w:b w:val="0"/>
+          <w:sz w:val="20"/>
+        </w:rPr>
+        <w:t>: O9 (f⁻=0.019), O8 (f⁻=0.013), O5 (f⁻=0.011)</w:t>
+      </w:r>
+    </w:p>
+    <w:p>
+      <w:pPr>
+        <w:jc w:val="center"/>
+      </w:pPr>
+      <w:r>
+        <w:drawing>
+          <wp:inline xmlns:a="http://schemas.openxmlformats.org/drawingml/2006/main" xmlns:pic="http://schemas.openxmlformats.org/drawingml/2006/picture">
+            <wp:extent cx="5212080" cy="2018957"/>
+            <wp:docPr id="9" name="Picture 9"/>
+            <wp:cNvGraphicFramePr>
+              <a:graphicFrameLocks noChangeAspect="1"/>
+            </wp:cNvGraphicFramePr>
+            <a:graphic>
+              <a:graphicData uri="http://schemas.openxmlformats.org/drawingml/2006/picture">
+                <pic:pic>
+                  <pic:nvPicPr>
+                    <pic:cNvPr id="0" name="fig4_trimethoprim_fukui.png"/>
+                    <pic:cNvPicPr/>
+                  </pic:nvPicPr>
+                  <pic:blipFill>
+                    <a:blip r:embed="rId17"/>
+                    <a:stretch>
+                      <a:fillRect/>
+                    </a:stretch>
+                  </pic:blipFill>
+                  <pic:spPr>
+                    <a:xfrm>
+                      <a:off x="0" y="0"/>
+                      <a:ext cx="5212080" cy="2018957"/>
+                    </a:xfrm>
+                    <a:prstGeom prst="rect"/>
+                  </pic:spPr>
+                </pic:pic>
+              </a:graphicData>
+            </a:graphic>
+          </wp:inline>
+        </w:drawing>
+      </w:r>
+    </w:p>
+    <w:p>
+      <w:pPr>
+        <w:jc w:val="center"/>
+      </w:pPr>
+      <w:r>
+        <w:rPr>
+          <w:i/>
+          <w:color w:val="718096"/>
+          <w:sz w:val="16"/>
+        </w:rPr>
+        <w:t>trimethoprim — condensed Fukui</w:t>
+      </w:r>
+    </w:p>
+    <w:p>
+      <w:pPr>
+        <w:jc w:val="center"/>
+      </w:pPr>
+      <w:r>
+        <w:drawing>
+          <wp:inline xmlns:a="http://schemas.openxmlformats.org/drawingml/2006/main" xmlns:pic="http://schemas.openxmlformats.org/drawingml/2006/picture">
+            <wp:extent cx="5212080" cy="2018957"/>
+            <wp:docPr id="10" name="Picture 10"/>
+            <wp:cNvGraphicFramePr>
+              <a:graphicFrameLocks noChangeAspect="1"/>
+            </wp:cNvGraphicFramePr>
+            <a:graphic>
+              <a:graphicData uri="http://schemas.openxmlformats.org/drawingml/2006/picture">
+                <pic:pic>
+                  <pic:nvPicPr>
+                    <pic:cNvPr id="0" name="fig4_sulfamethoxazole_fukui.png"/>
+                    <pic:cNvPicPr/>
+                  </pic:nvPicPr>
+                  <pic:blipFill>
+                    <a:blip r:embed="rId18"/>
+                    <a:stretch>
+                      <a:fillRect/>
+                    </a:stretch>
+                  </pic:blipFill>
+                  <pic:spPr>
+                    <a:xfrm>
+                      <a:off x="0" y="0"/>
+                      <a:ext cx="5212080" cy="2018957"/>
+                    </a:xfrm>
+                    <a:prstGeom prst="rect"/>
+                  </pic:spPr>
+                </pic:pic>
+              </a:graphicData>
+            </a:graphic>
+          </wp:inline>
+        </w:drawing>
+      </w:r>
+    </w:p>
+    <w:p>
+      <w:pPr>
+        <w:jc w:val="center"/>
+      </w:pPr>
+      <w:r>
+        <w:rPr>
+          <w:i/>
+          <w:color w:val="718096"/>
+          <w:sz w:val="16"/>
+        </w:rPr>
+        <w:t>sulfamethoxazole — condensed Fukui</w:t>
+      </w:r>
+    </w:p>
+    <w:p>
       <w:pPr>
         <w:pStyle w:val="Heading2"/>
       </w:pPr>
       <w:r>
         <w:t>3.6 Electrostatic-potential (ESP) map</w:t>
+      </w:r>
+    </w:p>
+    <w:p>
+      <w:pPr>
+        <w:jc w:val="center"/>
+      </w:pPr>
+      <w:r>
+        <w:drawing>
+          <wp:inline xmlns:a="http://schemas.openxmlformats.org/drawingml/2006/main" xmlns:pic="http://schemas.openxmlformats.org/drawingml/2006/picture">
+            <wp:extent cx="2651760" cy="2348964"/>
+            <wp:docPr id="11" name="Picture 11"/>
+            <wp:cNvGraphicFramePr>
+              <a:graphicFrameLocks noChangeAspect="1"/>
+            </wp:cNvGraphicFramePr>
+            <a:graphic>
+              <a:graphicData uri="http://schemas.openxmlformats.org/drawingml/2006/picture">
+                <pic:pic>
+                  <pic:nvPicPr>
+                    <pic:cNvPr id="0" name="fig7_trimethoprim_esp.png"/>
+                    <pic:cNvPicPr/>
+                  </pic:nvPicPr>
+                  <pic:blipFill>
+                    <a:blip r:embed="rId19"/>
+                    <a:stretch>
+                      <a:fillRect/>
+                    </a:stretch>
+                  </pic:blipFill>
+                  <pic:spPr>
+                    <a:xfrm>
+                      <a:off x="0" y="0"/>
+                      <a:ext cx="2651760" cy="2348964"/>
+                    </a:xfrm>
+                    <a:prstGeom prst="rect"/>
+                  </pic:spPr>
+                </pic:pic>
+              </a:graphicData>
+            </a:graphic>
+          </wp:inline>
+        </w:drawing>
+      </w:r>
+    </w:p>
+    <w:p>
+      <w:pPr>
+        <w:jc w:val="center"/>
+      </w:pPr>
+      <w:r>
+        <w:rPr>
+          <w:i/>
+          <w:color w:val="718096"/>
+          <w:sz w:val="16"/>
+        </w:rPr>
+        <w:t>trimethoprim — ESP map</w:t>
+      </w:r>
+    </w:p>
+    <w:p>
+      <w:pPr>
+        <w:jc w:val="center"/>
+      </w:pPr>
+      <w:r>
+        <w:drawing>
+          <wp:inline xmlns:a="http://schemas.openxmlformats.org/drawingml/2006/main" xmlns:pic="http://schemas.openxmlformats.org/drawingml/2006/picture">
+            <wp:extent cx="2651760" cy="2348964"/>
+            <wp:docPr id="12" name="Picture 12"/>
+            <wp:cNvGraphicFramePr>
+              <a:graphicFrameLocks noChangeAspect="1"/>
+            </wp:cNvGraphicFramePr>
+            <a:graphic>
+              <a:graphicData uri="http://schemas.openxmlformats.org/drawingml/2006/picture">
+                <pic:pic>
+                  <pic:nvPicPr>
+                    <pic:cNvPr id="0" name="fig7_sulfamethoxazole_esp.png"/>
+                    <pic:cNvPicPr/>
+                  </pic:nvPicPr>
+                  <pic:blipFill>
+                    <a:blip r:embed="rId20"/>
+                    <a:stretch>
+                      <a:fillRect/>
+                    </a:stretch>
+                  </pic:blipFill>
+                  <pic:spPr>
+                    <a:xfrm>
+                      <a:off x="0" y="0"/>
+                      <a:ext cx="2651760" cy="2348964"/>
+                    </a:xfrm>
+                    <a:prstGeom prst="rect"/>
+                  </pic:spPr>
+                </pic:pic>
+              </a:graphicData>
+            </a:graphic>
+          </wp:inline>
+        </w:drawing>
+      </w:r>
+    </w:p>
+    <w:p>
+      <w:pPr>
+        <w:jc w:val="center"/>
+      </w:pPr>
+      <w:r>
+        <w:rPr>
+          <w:i/>
+          <w:color w:val="718096"/>
+          <w:sz w:val="16"/>
+        </w:rPr>
+        <w:t>sulfamethoxazole — ESP map</w:t>
       </w:r>
     </w:p>
     <w:p>
@@ -2583,7 +3031,7 @@
         <w:drawing>
           <wp:inline xmlns:a="http://schemas.openxmlformats.org/drawingml/2006/main" xmlns:pic="http://schemas.openxmlformats.org/drawingml/2006/picture">
             <wp:extent cx="5212080" cy="2531818"/>
-            <wp:docPr id="5" name="Picture 5"/>
+            <wp:docPr id="13" name="Picture 13"/>
             <wp:cNvGraphicFramePr>
               <a:graphicFrameLocks noChangeAspect="1"/>
             </wp:cNvGraphicFramePr>
@@ -2595,7 +3043,7 @@
                     <pic:cNvPicPr/>
                   </pic:nvPicPr>
                   <pic:blipFill>
-                    <a:blip r:embed="rId13"/>
+                    <a:blip r:embed="rId21"/>
                     <a:stretch>
                       <a:fillRect/>
                     </a:stretch>
@@ -2635,7 +3083,7 @@
         <w:drawing>
           <wp:inline xmlns:a="http://schemas.openxmlformats.org/drawingml/2006/main" xmlns:pic="http://schemas.openxmlformats.org/drawingml/2006/picture">
             <wp:extent cx="5212080" cy="2531818"/>
-            <wp:docPr id="6" name="Picture 6"/>
+            <wp:docPr id="14" name="Picture 14"/>
             <wp:cNvGraphicFramePr>
               <a:graphicFrameLocks noChangeAspect="1"/>
             </wp:cNvGraphicFramePr>
@@ -2647,7 +3095,7 @@
                     <pic:cNvPicPr/>
                   </pic:nvPicPr>
                   <pic:blipFill>
-                    <a:blip r:embed="rId14"/>
+                    <a:blip r:embed="rId22"/>
                     <a:stretch>
                       <a:fillRect/>
                     </a:stretch>
@@ -2687,7 +3135,7 @@
         <w:drawing>
           <wp:inline xmlns:a="http://schemas.openxmlformats.org/drawingml/2006/main" xmlns:pic="http://schemas.openxmlformats.org/drawingml/2006/picture">
             <wp:extent cx="5212080" cy="2716362"/>
-            <wp:docPr id="7" name="Picture 7"/>
+            <wp:docPr id="15" name="Picture 15"/>
             <wp:cNvGraphicFramePr>
               <a:graphicFrameLocks noChangeAspect="1"/>
             </wp:cNvGraphicFramePr>
@@ -2699,7 +3147,7 @@
                     <pic:cNvPicPr/>
                   </pic:nvPicPr>
                   <pic:blipFill>
-                    <a:blip r:embed="rId15"/>
+                    <a:blip r:embed="rId23"/>
                     <a:stretch>
                       <a:fillRect/>
                     </a:stretch>
@@ -2739,7 +3187,7 @@
         <w:drawing>
           <wp:inline xmlns:a="http://schemas.openxmlformats.org/drawingml/2006/main" xmlns:pic="http://schemas.openxmlformats.org/drawingml/2006/picture">
             <wp:extent cx="5212080" cy="2713809"/>
-            <wp:docPr id="8" name="Picture 8"/>
+            <wp:docPr id="16" name="Picture 16"/>
             <wp:cNvGraphicFramePr>
               <a:graphicFrameLocks noChangeAspect="1"/>
             </wp:cNvGraphicFramePr>
@@ -2751,7 +3199,7 @@
                     <pic:cNvPicPr/>
                   </pic:nvPicPr>
                   <pic:blipFill>
-                    <a:blip r:embed="rId16"/>
+                    <a:blip r:embed="rId24"/>
                     <a:stretch>
                       <a:fillRect/>
                     </a:stretch>
@@ -2799,7 +3247,7 @@
         <w:drawing>
           <wp:inline xmlns:a="http://schemas.openxmlformats.org/drawingml/2006/main" xmlns:pic="http://schemas.openxmlformats.org/drawingml/2006/picture">
             <wp:extent cx="5212080" cy="2860766"/>
-            <wp:docPr id="9" name="Picture 9"/>
+            <wp:docPr id="17" name="Picture 17"/>
             <wp:cNvGraphicFramePr>
               <a:graphicFrameLocks noChangeAspect="1"/>
             </wp:cNvGraphicFramePr>
@@ -2811,7 +3259,7 @@
                     <pic:cNvPicPr/>
                   </pic:nvPicPr>
                   <pic:blipFill>
-                    <a:blip r:embed="rId17"/>
+                    <a:blip r:embed="rId25"/>
                     <a:stretch>
                       <a:fillRect/>
                     </a:stretch>
@@ -2851,7 +3299,7 @@
         <w:drawing>
           <wp:inline xmlns:a="http://schemas.openxmlformats.org/drawingml/2006/main" xmlns:pic="http://schemas.openxmlformats.org/drawingml/2006/picture">
             <wp:extent cx="5212080" cy="2860766"/>
-            <wp:docPr id="10" name="Picture 10"/>
+            <wp:docPr id="18" name="Picture 18"/>
             <wp:cNvGraphicFramePr>
               <a:graphicFrameLocks noChangeAspect="1"/>
             </wp:cNvGraphicFramePr>
@@ -2863,7 +3311,7 @@
                     <pic:cNvPicPr/>
                   </pic:nvPicPr>
                   <pic:blipFill>
-                    <a:blip r:embed="rId18"/>
+                    <a:blip r:embed="rId26"/>
                     <a:stretch>
                       <a:fillRect/>
                     </a:stretch>

</xml_diff>